<commit_message>
doc: update battery and HVAC performance reports with actual logs
</commit_message>
<xml_diff>
--- a/docs/report/Battery_HVAC_Performance_Tests/BMS_Battery_HVAC_Tests_Summary.docx
+++ b/docs/report/Battery_HVAC_Performance_Tests/BMS_Battery_HVAC_Tests_Summary.docx
@@ -212,7 +212,7 @@
           </w:tcPr>
           <w:p>
             <w:r>
-              <w:t>3.700 kW</w:t>
+              <w:t>1.268 kW</w:t>
             </w:r>
           </w:p>
         </w:tc>
@@ -222,7 +222,7 @@
           </w:tcPr>
           <w:p>
             <w:r>
-              <w:t>9.084 kW</w:t>
+              <w:t>1.326 kW</w:t>
             </w:r>
           </w:p>
         </w:tc>
@@ -254,7 +254,7 @@
           </w:tcPr>
           <w:p>
             <w:r>
-              <w:t>4.602 kW</w:t>
+              <w:t>2.308 kW</w:t>
             </w:r>
           </w:p>
         </w:tc>
@@ -264,7 +264,7 @@
           </w:tcPr>
           <w:p>
             <w:r>
-              <w:t>44.972 kW</w:t>
+              <w:t>6.378 kW</w:t>
             </w:r>
           </w:p>
         </w:tc>
@@ -298,9 +298,9 @@
           </w:tcPr>
           <w:p>
             <w:r>
-              <w:t>A: 14.43 A</w:t>
+              <w:t>A: 5.11 A</w:t>
               <w:br/>
-              <w:t>B: 14.50 A</w:t>
+              <w:t>B: 4.83 A</w:t>
             </w:r>
           </w:p>
         </w:tc>
@@ -310,9 +310,9 @@
           </w:tcPr>
           <w:p>
             <w:r>
-              <w:t>A: 35.14 A</w:t>
+              <w:t>A: 5.42 A</w:t>
               <w:br/>
-              <w:t>B: 35.89 A</w:t>
+              <w:t>B: 4.98 A</w:t>
             </w:r>
           </w:p>
         </w:tc>
@@ -346,9 +346,9 @@
           </w:tcPr>
           <w:p>
             <w:r>
-              <w:t>A: 127.89 V</w:t>
+              <w:t>A: 127.52 V</w:t>
               <w:br/>
-              <w:t>B: 127.90 V</w:t>
+              <w:t>B: 127.52 V</w:t>
             </w:r>
           </w:p>
         </w:tc>
@@ -358,9 +358,9 @@
           </w:tcPr>
           <w:p>
             <w:r>
-              <w:t>A: 127.90 V</w:t>
+              <w:t>A: 127.55 V</w:t>
               <w:br/>
-              <w:t>B: 127.90 V</w:t>
+              <w:t>B: 127.56 V</w:t>
             </w:r>
           </w:p>
         </w:tc>
@@ -392,7 +392,7 @@
           </w:tcPr>
           <w:p>
             <w:r>
-              <w:t>~3.697 kWh/h</w:t>
+              <w:t>~1.268 kWh/h</w:t>
             </w:r>
           </w:p>
         </w:tc>
@@ -402,7 +402,7 @@
           </w:tcPr>
           <w:p>
             <w:r>
-              <w:t>~9.100 kWh/h</w:t>
+              <w:t>~1.326 kWh/h</w:t>
             </w:r>
           </w:p>
         </w:tc>
@@ -476,7 +476,7 @@
           </w:tcPr>
           <w:p>
             <w:r>
-              <w:t>27.9 Hours</w:t>
+              <w:t>81.3 Hours</w:t>
             </w:r>
           </w:p>
         </w:tc>
@@ -486,7 +486,7 @@
           </w:tcPr>
           <w:p>
             <w:r>
-              <w:t>11.3 Hours</w:t>
+              <w:t>77.8 Hours</w:t>
             </w:r>
           </w:p>
         </w:tc>
@@ -508,7 +508,7 @@
         <w:t xml:space="preserve">• Impact of HVAC: </w:t>
       </w:r>
       <w:r>
-        <w:t>Activating the HVAC in the preparing state increases the power draw from 0.33 kW to 3.70 kW (an 11.2x increase). This reduces the standby battery runtime from 312.6 hours to 27.9 hours.</w:t>
+        <w:t>Activating the HVAC in the preparing state increases the power draw from 0.33 kW to 1.27 kW (an 3.8x increase). This reduces the standby battery runtime from 312.6 hours to 81.3 hours.</w:t>
         <w:br/>
         <w:br/>
       </w:r>
@@ -519,7 +519,7 @@
         <w:t xml:space="preserve">• Operational vs. Standby Power: </w:t>
       </w:r>
       <w:r>
-        <w:t>In dynamic operational state with continuous duty cycles, the average power consumption is 9.10 kW (traction, hoist, HVAC). The projected runtime is 11.3 Hours, which satisfies the 8-hour shift requirement with a 29% safety margin.</w:t>
+        <w:t>In dynamic operational state with continuous duty cycles, the average power consumption is 1.33 kW (traction, hoist, HVAC). The projected runtime is 77.8 Hours, which satisfies the 8-hour shift requirement with a 872% safety margin.</w:t>
         <w:br/>
         <w:br/>
       </w:r>
@@ -530,7 +530,7 @@
         <w:t xml:space="preserve">• Regenerative Energy Recovery: </w:t>
       </w:r>
       <w:r>
-        <w:t>Active energy regeneration returns up to -39 A per pack to the battery during lowering, recovering 15-25% energy and significantly extending operational runtime.</w:t>
+        <w:t>Active energy regeneration returns up to 2.6 A / 2.1 A to the battery during lowering, recovering 15-25% energy and significantly extending operational runtime.</w:t>
       </w:r>
     </w:p>
     <w:sectPr>

</xml_diff>